<commit_message>
Handover note: Pauline has her own account on the VM
Co-Authored-By: Claude Opus 5 <noreply@anthropic.com>
Claude-Session: https://claude.ai/code/session_018JAoc1BQgQ82dR8t2BxgrR
</commit_message>
<xml_diff>
--- a/hitl_bench/docs/passation_pauline.docx
+++ b/hitl_bench/docs/passation_pauline.docx
@@ -32,7 +32,7 @@
           <w:b w:val="0"/>
           <w:color w:val="5A6876"/>
         </w:rPr>
-        <w:t>Pour Pauline. Ce document suppose que tu n'as pas d'accès direct à la machine ; tout ce qui demande cet accès est marqué [SSH] et passe par le SEGI, ou par toi si un accès t'a été ouvert avant le départ de Mathilde.</w:t>
+        <w:t>Pour Pauline. Tu as un compte sur la machine (utilisateur pauline, avec sudo) ; tout ce qui est marqué [SSH] se fait en te connectant depuis le campus ou le VPN avec : ssh pauline@fsc-cloud163.segi.ulg.ac.be, puis en mettant sudo devant la commande. Change ton mot de passe à la première connexion (passwd).</w:t>
       </w:r>
     </w:p>
     <w:p>
@@ -211,7 +211,7 @@
               <w:rPr>
                 <w:sz w:val="19"/>
               </w:rPr>
-              <w:t>[SSH] accessible uniquement depuis le réseau de l'université ou le VPN</w:t>
+              <w:t>[SSH] depuis le réseau de l'université ou le VPN, compte pauline</w:t>
             </w:r>
           </w:p>
         </w:tc>
@@ -659,7 +659,7 @@
         <w:rPr>
           <w:b w:val="0"/>
         </w:rPr>
-        <w:t>Dans l'ordre des probabilités. Tout ce qui est [SSH] se demande au SEGI (helpdesk) en donnant le nom de la machine et la commande ; ils savent faire.</w:t>
+        <w:t>Dans l'ordre des probabilités. Les commandes [SSH] se tapent sur la machine, précédées de sudo. En cas de doute, ne rien faire d'autre que ce qui est écrit ici et prévenir Mathilde.</w:t>
       </w:r>
     </w:p>
     <w:p>
@@ -681,7 +681,7 @@
           <w:rFonts w:ascii="Consolas" w:hAnsi="Consolas"/>
           <w:sz w:val="19"/>
         </w:rPr>
-        <w:t>systemctl restart reacto</w:t>
+        <w:t>sudo systemctl restart reacto</w:t>
       </w:r>
       <w:r>
         <w:t xml:space="preserve">, attendre une minute, réessayer. Si toujours rien : </w:t>
@@ -691,7 +691,7 @@
           <w:rFonts w:ascii="Consolas" w:hAnsi="Consolas"/>
           <w:sz w:val="19"/>
         </w:rPr>
-        <w:t>systemctl status reacto nginx</w:t>
+        <w:t>sudo systemctl status reacto nginx</w:t>
       </w:r>
       <w:r>
         <w:t xml:space="preserve"> et envoyer la sortie à Mathilde.</w:t>
@@ -781,7 +781,7 @@
           <w:rFonts w:ascii="Consolas" w:hAnsi="Consolas"/>
           <w:sz w:val="19"/>
         </w:rPr>
-        <w:t>nginx -t &amp;&amp; systemctl reload nginx</w:t>
+        <w:t>sudo nginx -t &amp;&amp; sudo systemctl reload nginx</w:t>
       </w:r>
       <w:r>
         <w:t>. Mathilde peut guider à distance.</w:t>
@@ -806,7 +806,7 @@
           <w:rFonts w:ascii="Consolas" w:hAnsi="Consolas"/>
           <w:sz w:val="19"/>
         </w:rPr>
-        <w:t>ls /opt/reacto/hitl_bench/forms/live/</w:t>
+        <w:t>sudo ls /opt/reacto/hitl_bench/forms/live/</w:t>
       </w:r>
       <w:r>
         <w:t xml:space="preserve"> contient bien un fichier à ses initiales ; sinon, la sauvegarde de la veille est dans </w:t>
@@ -880,7 +880,7 @@
           <w:rFonts w:ascii="Consolas" w:hAnsi="Consolas"/>
           <w:sz w:val="19"/>
         </w:rPr>
-        <w:t>cd /opt/reacto &amp;&amp; .venv/bin/python -m hitl_bench.scripts.collect_live</w:t>
+        <w:t>cd /opt/reacto &amp;&amp; sudo .venv/bin/python -m hitl_bench.scripts.collect_live</w:t>
       </w:r>
       <w:r>
         <w:t xml:space="preserve"> produit deux tableaux dans </w:t>
@@ -997,7 +997,7 @@
               <w:rPr>
                 <w:sz w:val="19"/>
               </w:rPr>
-              <w:t>La machine, le certificat, un accès SSH pour toi</w:t>
+              <w:t>La machine elle-même (panne matérielle, réseau) et le certificat</w:t>
             </w:r>
           </w:p>
         </w:tc>
@@ -1079,7 +1079,7 @@
               <w:rPr>
                 <w:sz w:val="21"/>
               </w:rPr>
-              <w:t>demander au SEGI un accès SSH pour Pauline (sinon chaque panne passe par leur helpdesk) ; vérifier que Pauline a ce document, la liste des chimistes invités et la date limite ; faire une fois ensemble le test « page + Resume » dans un navigateur.</w:t>
+              <w:t>une première connexion SSH de Pauline avec changement de mot de passe, et un sudo systemctl status reacto pour voir que ça marche ; vérifier que Pauline a ce document, la liste des chimistes invités et la date limite ; faire une fois ensemble le test « page + Resume » dans un navigateur.</w:t>
             </w:r>
           </w:p>
         </w:tc>

</xml_diff>